<commit_message>
S64: Bible v2.2 - varied hook/fixed handshake, The Turn, shot list per beat, caption/title block, cover concept in kill criterion
</commit_message>
<xml_diff>
--- a/roamwithchris/RoamWithChris_StoryBible_Protocol.docx
+++ b/roamwithchris/RoamWithChris_StoryBible_Protocol.docx
@@ -17,7 +17,7 @@
         <w:jc w:val="center"/>
       </w:pPr>
       <w:r>
-        <w:t xml:space="preserve">STORY BIBLE PROTOCOL — v2.1</w:t>
+        <w:t xml:space="preserve">STORY BIBLE PROTOCOL — v2.2</w:t>
       </w:r>
     </w:p>
     <w:p>
@@ -30,7 +30,7 @@
           <w:iCs/>
           <w:color w:val="555555"/>
         </w:rPr>
-        <w:t xml:space="preserve">Complete CORE sections before writing any script. EXTENDED sections fill if time allows. Growth is the primary goal; memoir-for-Auggie is the frame carried inside the growth mechanics.</w:t>
+        <w:t xml:space="preserve">Complete CORE sections before writing any script. EXTENDED fills if time allows. Growth is the primary goal; memoir-for-Auggie is the frame carried inside the growth mechanics. Companion docs: Standing Capture Kit + Production Pipeline (same folder).</w:t>
       </w:r>
     </w:p>
     <w:p>
@@ -80,91 +80,32 @@
     </w:p>
     <w:p>
       <w:pPr>
-        <w:pStyle w:val="Heading1"/>
-        <w:spacing w:after="120" w:before="300"/>
-      </w:pPr>
-      <w:r>
-        <w:t xml:space="preserve">SERIES CONSTANTS — NEVER CHANGE</w:t>
-      </w:r>
-    </w:p>
-    <w:p>
-      <w:pPr>
-        <w:spacing w:after="60"/>
-      </w:pPr>
-      <w:r>
-        <w:rPr>
-          <w:b/>
-          <w:bCs/>
-        </w:rPr>
-        <w:t xml:space="preserve">Signature Opener:</w:t>
-      </w:r>
-    </w:p>
-    <w:p>
-      <w:pPr>
-        <w:spacing w:after="100"/>
-      </w:pPr>
-      <w:r>
-        <w:t xml:space="preserve">"You won't remember this. So let me tell you."</w:t>
-      </w:r>
-    </w:p>
-    <w:p>
-      <w:pPr>
-        <w:spacing w:after="60"/>
-      </w:pPr>
-      <w:r>
-        <w:rPr>
-          <w:b/>
-          <w:bCs/>
-        </w:rPr>
-        <w:t xml:space="preserve">Series Tagline:</w:t>
-      </w:r>
-    </w:p>
-    <w:p>
-      <w:pPr>
-        <w:spacing w:after="100"/>
-      </w:pPr>
-      <w:r>
-        <w:t xml:space="preserve">"This is one of the stories I kept for you."</w:t>
-      </w:r>
-    </w:p>
-    <w:p>
-      <w:pPr>
-        <w:spacing w:after="60"/>
-      </w:pPr>
-      <w:r>
-        <w:rPr>
-          <w:b/>
-          <w:bCs/>
-        </w:rPr>
-        <w:t xml:space="preserve">Voice / POV:</w:t>
-      </w:r>
-    </w:p>
-    <w:p>
-      <w:pPr>
-        <w:spacing w:after="100"/>
-      </w:pPr>
-      <w:r>
-        <w:t xml:space="preserve">Chris speaking directly TO Auggie. Always 'you.' Never 'Auggie did X.' Never third person.</w:t>
-      </w:r>
-    </w:p>
-    <w:p>
-      <w:pPr>
-        <w:spacing w:after="60"/>
-      </w:pPr>
-      <w:r>
-        <w:rPr>
-          <w:b/>
-          <w:bCs/>
-        </w:rPr>
-        <w:t xml:space="preserve">Hook Format (v2.1 — opener moved AFTER hook):</w:t>
-      </w:r>
-    </w:p>
-    <w:p>
-      <w:pPr>
-        <w:spacing w:after="100"/>
-      </w:pPr>
-      <w:r>
-        <w:t xml:space="preserve">Auggie hero visual (frame 1, must be the pattern interrupt itself — motion or tension, never a static cute shot) → AI baby text 'Daddy tell me a story' → FIRST STORY BEAT LANDS → signature opener → story continues.</w:t>
+        <w:spacing w:after="100"/>
+      </w:pPr>
+      <w:r>
+        <w:rPr>
+          <w:b/>
+          <w:bCs/>
+        </w:rPr>
+        <w:t xml:space="preserve">Cover concept — describe the frame-1 image (it doubles as your cover/thumbnail): </w:t>
+      </w:r>
+      <w:r>
+        <w:t xml:space="preserve">_______________________________________________</w:t>
+      </w:r>
+    </w:p>
+    <w:p>
+      <w:pPr>
+        <w:spacing w:after="100"/>
+      </w:pPr>
+      <w:r>
+        <w:rPr>
+          <w:b/>
+          <w:bCs/>
+        </w:rPr>
+        <w:t xml:space="preserve">Cover text (0–3 words, center-frame — grid crops to 4:5/1:1): </w:t>
+      </w:r>
+      <w:r>
+        <w:t xml:space="preserve">_______________________________________________</w:t>
       </w:r>
     </w:p>
     <w:p>
@@ -177,47 +118,96 @@
           <w:iCs/>
           <w:color w:val="555555"/>
         </w:rPr>
-        <w:t xml:space="preserve">Grabbing attention is priority (Chris, S64). The opener is brand, not hook — it earns its place only after the viewer has decided to stay. Its exact position remains a testable variable; log in Retention Review.</w:t>
-      </w:r>
-    </w:p>
-    <w:p>
-      <w:pPr>
-        <w:spacing w:after="60"/>
-      </w:pPr>
-      <w:r>
-        <w:rPr>
-          <w:b/>
-          <w:bCs/>
-        </w:rPr>
-        <w:t xml:space="preserve">Lesson Format:</w:t>
-      </w:r>
-    </w:p>
-    <w:p>
-      <w:pPr>
-        <w:spacing w:after="100"/>
-      </w:pPr>
-      <w:r>
-        <w:t xml:space="preserve">One line woven into voiceover near the end + full lesson breakdown in pinned comment + future compilation reel.</w:t>
-      </w:r>
-    </w:p>
-    <w:p>
-      <w:pPr>
-        <w:spacing w:after="60"/>
-      </w:pPr>
-      <w:r>
-        <w:rPr>
-          <w:b/>
-          <w:bCs/>
-        </w:rPr>
-        <w:t xml:space="preserve">Cut Length:</w:t>
-      </w:r>
-    </w:p>
-    <w:p>
-      <w:pPr>
-        <w:spacing w:after="100"/>
-      </w:pPr>
-      <w:r>
-        <w:t xml:space="preserve">Under 1 second per clip. Script lines = 3–5 words max each.</w:t>
+        <w:t xml:space="preserve">MrBeast rule: if you can't picture a clickable cover before production, the concept is weak. Frame 1 does triple duty: hook, auto-cover in feed, and often the YouTube Shorts thumbnail.</w:t>
+      </w:r>
+    </w:p>
+    <w:p>
+      <w:pPr>
+        <w:pStyle w:val="Heading1"/>
+        <w:spacing w:after="120" w:before="300"/>
+      </w:pPr>
+      <w:r>
+        <w:t xml:space="preserve">SERIES CONSTANTS — NEVER CHANGE</w:t>
+      </w:r>
+    </w:p>
+    <w:p>
+      <w:pPr>
+        <w:spacing w:after="60"/>
+      </w:pPr>
+      <w:r>
+        <w:rPr>
+          <w:b/>
+          <w:bCs/>
+        </w:rPr>
+        <w:t xml:space="preserve">Signature Opener:</w:t>
+      </w:r>
+    </w:p>
+    <w:p>
+      <w:pPr>
+        <w:spacing w:after="100"/>
+      </w:pPr>
+      <w:r>
+        <w:t xml:space="preserve">"You won't remember this. So let me tell you."</w:t>
+      </w:r>
+    </w:p>
+    <w:p>
+      <w:pPr>
+        <w:spacing w:after="60"/>
+      </w:pPr>
+      <w:r>
+        <w:rPr>
+          <w:b/>
+          <w:bCs/>
+        </w:rPr>
+        <w:t xml:space="preserve">Series Tagline:</w:t>
+      </w:r>
+    </w:p>
+    <w:p>
+      <w:pPr>
+        <w:spacing w:after="100"/>
+      </w:pPr>
+      <w:r>
+        <w:t xml:space="preserve">"This is one of the stories I kept for you."</w:t>
+      </w:r>
+    </w:p>
+    <w:p>
+      <w:pPr>
+        <w:spacing w:after="60"/>
+      </w:pPr>
+      <w:r>
+        <w:rPr>
+          <w:b/>
+          <w:bCs/>
+        </w:rPr>
+        <w:t xml:space="preserve">Voice / POV:</w:t>
+      </w:r>
+    </w:p>
+    <w:p>
+      <w:pPr>
+        <w:spacing w:after="100"/>
+      </w:pPr>
+      <w:r>
+        <w:t xml:space="preserve">Chris speaking directly TO Auggie. Always 'you.' Never 'Auggie did X.' Never third person.</w:t>
+      </w:r>
+    </w:p>
+    <w:p>
+      <w:pPr>
+        <w:spacing w:after="60"/>
+      </w:pPr>
+      <w:r>
+        <w:rPr>
+          <w:b/>
+          <w:bCs/>
+        </w:rPr>
+        <w:t xml:space="preserve">Hook Format (v2.2 — varied hook, fixed handshake):</w:t>
+      </w:r>
+    </w:p>
+    <w:p>
+      <w:pPr>
+        <w:spacing w:after="100"/>
+      </w:pPr>
+      <w:r>
+        <w:t xml:space="preserve">Frame 1 = the strongest available pattern interrupt FOR THIS STORY — no default subject. Auggie sometimes, a freeway at 110mph sometimes, pitch-black audio sometimes. → First story beat lands → SERIES HANDSHAKE: AI baby text 'Daddy tell me a story' + signature opener (~sec 4–6) → story continues.</w:t>
       </w:r>
     </w:p>
     <w:p>
@@ -230,7 +220,60 @@
           <w:iCs/>
           <w:color w:val="555555"/>
         </w:rPr>
-        <w:t xml:space="preserve">Attention window (2026 data): viewers decide within ~1.7 seconds. Highest-weight Reels signal is DM shares. Design hook and ending around 'who sends this to whom.'</w:t>
+        <w:t xml:space="preserve">Surprise owns seconds 0–2; recognition arrives at 4–6. A pattern interrupt stops working once it becomes the pattern — never reuse the same hook subject or hook type back-to-back.</w:t>
+      </w:r>
+    </w:p>
+    <w:p>
+      <w:pPr>
+        <w:spacing w:after="60"/>
+      </w:pPr>
+      <w:r>
+        <w:rPr>
+          <w:b/>
+          <w:bCs/>
+        </w:rPr>
+        <w:t xml:space="preserve">Lesson Format:</w:t>
+      </w:r>
+    </w:p>
+    <w:p>
+      <w:pPr>
+        <w:spacing w:after="100"/>
+      </w:pPr>
+      <w:r>
+        <w:t xml:space="preserve">One line woven into voiceover near the end + full lesson breakdown in pinned comment + future compilation reel.</w:t>
+      </w:r>
+    </w:p>
+    <w:p>
+      <w:pPr>
+        <w:spacing w:after="60"/>
+      </w:pPr>
+      <w:r>
+        <w:rPr>
+          <w:b/>
+          <w:bCs/>
+        </w:rPr>
+        <w:t xml:space="preserve">Cut Length:</w:t>
+      </w:r>
+    </w:p>
+    <w:p>
+      <w:pPr>
+        <w:spacing w:after="100"/>
+      </w:pPr>
+      <w:r>
+        <w:t xml:space="preserve">Under 1 second per clip. Script lines = 3–5 words max each.</w:t>
+      </w:r>
+    </w:p>
+    <w:p>
+      <w:pPr>
+        <w:spacing w:after="120"/>
+      </w:pPr>
+      <w:r>
+        <w:rPr>
+          <w:i/>
+          <w:iCs/>
+          <w:color w:val="555555"/>
+        </w:rPr>
+        <w:t xml:space="preserve">Attention window: ~1.7 sec scroll decision. Highest-weight Reels signal: DM shares. ~85% of shortform watched muted — text layer carries the hook.</w:t>
       </w:r>
     </w:p>
     <w:p>
@@ -287,19 +330,34 @@
         <w:spacing w:after="100"/>
       </w:pPr>
       <w:r>
-        <w:t xml:space="preserve">Pattern Interrupt / Curiosity Gap / Direct Question / Bold Claim / Problem / Social Proof. (Pattern Interrupt and Curiosity Gap benchmark highest 3-second hold — favor these.)</w:t>
-      </w:r>
-    </w:p>
-    <w:p>
-      <w:pPr>
-        <w:spacing w:after="100"/>
-      </w:pPr>
-      <w:r>
-        <w:rPr>
-          <w:b/>
-          <w:bCs/>
-        </w:rPr>
-        <w:t xml:space="preserve">Frame 1 — the Auggie hero visual: what motion/tension makes it a pattern interrupt: </w:t>
+        <w:t xml:space="preserve">Pattern Interrupt / Curiosity Gap / Direct Question / Bold Claim / Problem / Social Proof.</w:t>
+      </w:r>
+    </w:p>
+    <w:p>
+      <w:pPr>
+        <w:spacing w:after="100"/>
+      </w:pPr>
+      <w:r>
+        <w:rPr>
+          <w:b/>
+          <w:bCs/>
+        </w:rPr>
+        <w:t xml:space="preserve">Same hook type OR subject as previous episode? Justify or change: </w:t>
+      </w:r>
+      <w:r>
+        <w:t xml:space="preserve">_______________________________________________</w:t>
+      </w:r>
+    </w:p>
+    <w:p>
+      <w:pPr>
+        <w:spacing w:after="100"/>
+      </w:pPr>
+      <w:r>
+        <w:rPr>
+          <w:b/>
+          <w:bCs/>
+        </w:rPr>
+        <w:t xml:space="preserve">Frame 1 — what motion/tension makes it a pattern interrupt (this is also your cover): </w:t>
       </w:r>
       <w:r>
         <w:t xml:space="preserve">_______________________________________________</w:t>
@@ -344,10 +402,236 @@
           <w:b/>
           <w:bCs/>
         </w:rPr>
-        <w:t xml:space="preserve">First story beat that lands BEFORE the signature opener: </w:t>
-      </w:r>
-      <w:r>
-        <w:t xml:space="preserve">_______________________________________________</w:t>
+        <w:t xml:space="preserve">First story beat that lands BEFORE the series handshake: </w:t>
+      </w:r>
+      <w:r>
+        <w:t xml:space="preserve">_______________________________________________</w:t>
+      </w:r>
+    </w:p>
+    <w:p>
+      <w:pPr>
+        <w:pStyle w:val="Heading1"/>
+        <w:spacing w:after="120" w:before="300"/>
+      </w:pPr>
+      <w:r>
+        <w:t xml:space="preserve">2. VOICE &amp; POV (CORE)</w:t>
+      </w:r>
+    </w:p>
+    <w:p>
+      <w:pPr>
+        <w:spacing w:after="100"/>
+      </w:pPr>
+      <w:r>
+        <w:t xml:space="preserve">Who is talking: Chris, directly to Auggie</w:t>
+      </w:r>
+    </w:p>
+    <w:p>
+      <w:pPr>
+        <w:spacing w:after="100"/>
+      </w:pPr>
+      <w:r>
+        <w:t xml:space="preserve">Tense: Past tense, first person</w:t>
+      </w:r>
+    </w:p>
+    <w:p>
+      <w:pPr>
+        <w:spacing w:after="100"/>
+      </w:pPr>
+      <w:r>
+        <w:t xml:space="preserve">Tone: Warm, dry humor, campfire storyteller — never hype, never dramatic</w:t>
+      </w:r>
+    </w:p>
+    <w:p>
+      <w:pPr>
+        <w:spacing w:after="100"/>
+      </w:pPr>
+      <w:r>
+        <w:t xml:space="preserve">Never: Third person ('Auggie did X'), second-person distance ('he'), sentimental or greeting-card language</w:t>
+      </w:r>
+    </w:p>
+    <w:p>
+      <w:pPr>
+        <w:pStyle w:val="Heading1"/>
+        <w:spacing w:after="120" w:before="300"/>
+      </w:pPr>
+      <w:r>
+        <w:t xml:space="preserve">3. CHARACTERS + CAST CONSISTENCY CHECK (CORE)</w:t>
+      </w:r>
+    </w:p>
+    <w:p>
+      <w:pPr>
+        <w:spacing w:after="100"/>
+      </w:pPr>
+      <w:r>
+        <w:t xml:space="preserve">Fill in all characters: role, key detail, and moment in this story.</w:t>
+      </w:r>
+    </w:p>
+    <w:p>
+      <w:pPr>
+        <w:spacing w:after="100"/>
+      </w:pPr>
+      <w:r>
+        <w:rPr>
+          <w:b/>
+          <w:bCs/>
+        </w:rPr>
+        <w:t xml:space="preserve">Which established cast members appear: </w:t>
+      </w:r>
+      <w:r>
+        <w:t xml:space="preserve">_______________________________________________</w:t>
+      </w:r>
+    </w:p>
+    <w:p>
+      <w:pPr>
+        <w:spacing w:after="100"/>
+      </w:pPr>
+      <w:r>
+        <w:rPr>
+          <w:b/>
+          <w:bCs/>
+        </w:rPr>
+        <w:t xml:space="preserve">Locked traits preserved? (Kate=planner, Golfii=warrior, Chris=narrator/mosquito magnet, Auggie=audience, Pumpkin=veteran): </w:t>
+      </w:r>
+      <w:r>
+        <w:t xml:space="preserve">_______________________________________________</w:t>
+      </w:r>
+    </w:p>
+    <w:p>
+      <w:pPr>
+        <w:spacing w:after="100"/>
+      </w:pPr>
+      <w:r>
+        <w:rPr>
+          <w:b/>
+          <w:bCs/>
+        </w:rPr>
+        <w:t xml:space="preserve">New character? Role + one defining detail + one moment: </w:t>
+      </w:r>
+      <w:r>
+        <w:t xml:space="preserve">_______________________________________________</w:t>
+      </w:r>
+    </w:p>
+    <w:p>
+      <w:pPr>
+        <w:pStyle w:val="Heading1"/>
+        <w:spacing w:after="120" w:before="300"/>
+      </w:pPr>
+      <w:r>
+        <w:t xml:space="preserve">4. WHAT / WHERE / WHEN / WHY (CORE)</w:t>
+      </w:r>
+    </w:p>
+    <w:p>
+      <w:pPr>
+        <w:spacing w:after="100"/>
+      </w:pPr>
+      <w:r>
+        <w:rPr>
+          <w:b/>
+          <w:bCs/>
+        </w:rPr>
+        <w:t xml:space="preserve">What happened: </w:t>
+      </w:r>
+      <w:r>
+        <w:t xml:space="preserve">_______________________________________________</w:t>
+      </w:r>
+    </w:p>
+    <w:p>
+      <w:pPr>
+        <w:spacing w:after="100"/>
+      </w:pPr>
+      <w:r>
+        <w:rPr>
+          <w:b/>
+          <w:bCs/>
+        </w:rPr>
+        <w:t xml:space="preserve">Where: </w:t>
+      </w:r>
+      <w:r>
+        <w:t xml:space="preserve">_______________________________________________</w:t>
+      </w:r>
+    </w:p>
+    <w:p>
+      <w:pPr>
+        <w:spacing w:after="100"/>
+      </w:pPr>
+      <w:r>
+        <w:rPr>
+          <w:b/>
+          <w:bCs/>
+        </w:rPr>
+        <w:t xml:space="preserve">When: </w:t>
+      </w:r>
+      <w:r>
+        <w:t xml:space="preserve">_______________________________________________</w:t>
+      </w:r>
+    </w:p>
+    <w:p>
+      <w:pPr>
+        <w:spacing w:after="100"/>
+      </w:pPr>
+      <w:r>
+        <w:rPr>
+          <w:b/>
+          <w:bCs/>
+        </w:rPr>
+        <w:t xml:space="preserve">Why this trip: </w:t>
+      </w:r>
+      <w:r>
+        <w:t xml:space="preserve">_______________________________________________</w:t>
+      </w:r>
+    </w:p>
+    <w:p>
+      <w:pPr>
+        <w:spacing w:after="100"/>
+      </w:pPr>
+      <w:r>
+        <w:rPr>
+          <w:b/>
+          <w:bCs/>
+        </w:rPr>
+        <w:t xml:space="preserve">The stated goal: </w:t>
+      </w:r>
+      <w:r>
+        <w:t xml:space="preserve">_______________________________________________</w:t>
+      </w:r>
+    </w:p>
+    <w:p>
+      <w:pPr>
+        <w:spacing w:after="100"/>
+      </w:pPr>
+      <w:r>
+        <w:rPr>
+          <w:b/>
+          <w:bCs/>
+        </w:rPr>
+        <w:t xml:space="preserve">The actual outcome: </w:t>
+      </w:r>
+      <w:r>
+        <w:t xml:space="preserve">_______________________________________________</w:t>
+      </w:r>
+    </w:p>
+    <w:p>
+      <w:pPr>
+        <w:spacing w:after="100"/>
+      </w:pPr>
+      <w:r>
+        <w:rPr>
+          <w:b/>
+          <w:bCs/>
+        </w:rPr>
+        <w:t xml:space="preserve">The real goal (what actually mattered): </w:t>
+      </w:r>
+      <w:r>
+        <w:t xml:space="preserve">_______________________________________________</w:t>
+      </w:r>
+    </w:p>
+    <w:p>
+      <w:pPr>
+        <w:pStyle w:val="Heading1"/>
+        <w:spacing w:after="120" w:before="300"/>
+      </w:pPr>
+      <w:r>
+        <w:t xml:space="preserve">5. THE TURN (CORE — fill if the story has one, NEVER force it)</w:t>
       </w:r>
     </w:p>
     <w:p>
@@ -360,107 +644,79 @@
           <w:iCs/>
           <w:color w:val="555555"/>
         </w:rPr>
-        <w:t xml:space="preserve">All layers point at one single reason to stay. Most Reels are watched muted — the text layer carries the hook alone for many viewers.</w:t>
-      </w:r>
-    </w:p>
-    <w:p>
-      <w:pPr>
-        <w:pStyle w:val="Heading1"/>
-        <w:spacing w:after="120" w:before="300"/>
-      </w:pPr>
-      <w:r>
-        <w:t xml:space="preserve">2. VOICE &amp; POV (CORE)</w:t>
-      </w:r>
-    </w:p>
-    <w:p>
-      <w:pPr>
-        <w:spacing w:after="100"/>
-      </w:pPr>
-      <w:r>
-        <w:t xml:space="preserve">Who is talking: Chris, directly to Auggie</w:t>
-      </w:r>
-    </w:p>
-    <w:p>
-      <w:pPr>
-        <w:spacing w:after="100"/>
-      </w:pPr>
-      <w:r>
-        <w:t xml:space="preserve">Tense: Past tense, first person</w:t>
-      </w:r>
-    </w:p>
-    <w:p>
-      <w:pPr>
-        <w:spacing w:after="100"/>
-      </w:pPr>
-      <w:r>
-        <w:t xml:space="preserve">Tone: Warm, dry humor, campfire storyteller — never hype, never dramatic</w:t>
-      </w:r>
-    </w:p>
-    <w:p>
-      <w:pPr>
-        <w:spacing w:after="100"/>
-      </w:pPr>
-      <w:r>
-        <w:t xml:space="preserve">Never: Third person ('Auggie did X'), second-person distance ('he'), sentimental or greeting-card language</w:t>
-      </w:r>
-    </w:p>
-    <w:p>
-      <w:pPr>
-        <w:pStyle w:val="Heading1"/>
-        <w:spacing w:after="120" w:before="300"/>
-      </w:pPr>
-      <w:r>
-        <w:t xml:space="preserve">3. CHARACTERS + CAST CONSISTENCY CHECK (CORE)</w:t>
-      </w:r>
-    </w:p>
-    <w:p>
-      <w:pPr>
-        <w:spacing w:after="100"/>
-      </w:pPr>
-      <w:r>
-        <w:t xml:space="preserve">Fill in all characters: role, key detail, and moment in this story.</w:t>
-      </w:r>
-    </w:p>
-    <w:p>
-      <w:pPr>
-        <w:spacing w:after="100"/>
-      </w:pPr>
-      <w:r>
-        <w:rPr>
-          <w:b/>
-          <w:bCs/>
-        </w:rPr>
-        <w:t xml:space="preserve">Which established cast members appear: </w:t>
-      </w:r>
-      <w:r>
-        <w:t xml:space="preserve">_______________________________________________</w:t>
-      </w:r>
-    </w:p>
-    <w:p>
-      <w:pPr>
-        <w:spacing w:after="100"/>
-      </w:pPr>
-      <w:r>
-        <w:rPr>
-          <w:b/>
-          <w:bCs/>
-        </w:rPr>
-        <w:t xml:space="preserve">Locked traits preserved? (Kate=planner, Golfii=warrior, Chris=narrator/mosquito magnet, Auggie=audience, Pumpkin=veteran): </w:t>
-      </w:r>
-      <w:r>
-        <w:t xml:space="preserve">_______________________________________________</w:t>
-      </w:r>
-    </w:p>
-    <w:p>
-      <w:pPr>
-        <w:spacing w:after="100"/>
-      </w:pPr>
-      <w:r>
-        <w:rPr>
-          <w:b/>
-          <w:bCs/>
-        </w:rPr>
-        <w:t xml:space="preserve">New character? Role + one defining detail + one moment (a role AND a moment, never just a cameo): </w:t>
+        <w:t xml:space="preserve">A twist must be surprising yet inevitable in hindsight — planted clues make it rewatchable; no clues makes it a cheat. Not every story has a Turn. Forcing one produces a fake gotcha.</w:t>
+      </w:r>
+    </w:p>
+    <w:p>
+      <w:pPr>
+        <w:spacing w:after="100"/>
+      </w:pPr>
+      <w:r>
+        <w:rPr>
+          <w:b/>
+          <w:bCs/>
+        </w:rPr>
+        <w:t xml:space="preserve">False assumption the viewer will build (decide this FIRST): </w:t>
+      </w:r>
+      <w:r>
+        <w:t xml:space="preserve">_______________________________________________</w:t>
+      </w:r>
+    </w:p>
+    <w:p>
+      <w:pPr>
+        <w:spacing w:after="100"/>
+      </w:pPr>
+      <w:r>
+        <w:rPr>
+          <w:b/>
+          <w:bCs/>
+        </w:rPr>
+        <w:t xml:space="preserve">Beats that plant it — through EMPHASIS, never stated out loud: </w:t>
+      </w:r>
+      <w:r>
+        <w:t xml:space="preserve">_______________________________________________</w:t>
+      </w:r>
+    </w:p>
+    <w:p>
+      <w:pPr>
+        <w:spacing w:after="100"/>
+      </w:pPr>
+      <w:r>
+        <w:rPr>
+          <w:b/>
+          <w:bCs/>
+        </w:rPr>
+        <w:t xml:space="preserve">The reveal beat #: </w:t>
+      </w:r>
+      <w:r>
+        <w:t xml:space="preserve">_______________________________________________</w:t>
+      </w:r>
+    </w:p>
+    <w:p>
+      <w:pPr>
+        <w:spacing w:after="100"/>
+      </w:pPr>
+      <w:r>
+        <w:rPr>
+          <w:b/>
+          <w:bCs/>
+        </w:rPr>
+        <w:t xml:space="preserve">Hindsight check — what clues make it inevitable on rewatch: </w:t>
+      </w:r>
+      <w:r>
+        <w:t xml:space="preserve">_______________________________________________</w:t>
+      </w:r>
+    </w:p>
+    <w:p>
+      <w:pPr>
+        <w:spacing w:after="100"/>
+      </w:pPr>
+      <w:r>
+        <w:rPr>
+          <w:b/>
+          <w:bCs/>
+        </w:rPr>
+        <w:t xml:space="preserve">Mission change (if any): old mission → new mission, at beat #: </w:t>
       </w:r>
       <w:r>
         <w:t xml:space="preserve">_______________________________________________</w:t>
@@ -476,7 +732,7 @@
           <w:iCs/>
           <w:color w:val="555555"/>
         </w:rPr>
-        <w:t xml:space="preserve">Recurring characters with stable traits are the strongest documented driver of return viewership (parasocial bond — MrBeast production notes + travel-vlog research).</w:t>
+        <w:t xml:space="preserve">Beats connect by BUT or THEREFORE, never 'and then.' A mission change is a giant BUT at the midpoint.</w:t>
       </w:r>
     </w:p>
     <w:p>
@@ -485,121 +741,7 @@
         <w:spacing w:after="120" w:before="300"/>
       </w:pPr>
       <w:r>
-        <w:t xml:space="preserve">4. WHAT / WHERE / WHEN / WHY (CORE)</w:t>
-      </w:r>
-    </w:p>
-    <w:p>
-      <w:pPr>
-        <w:spacing w:after="100"/>
-      </w:pPr>
-      <w:r>
-        <w:rPr>
-          <w:b/>
-          <w:bCs/>
-        </w:rPr>
-        <w:t xml:space="preserve">What happened: </w:t>
-      </w:r>
-      <w:r>
-        <w:t xml:space="preserve">_______________________________________________</w:t>
-      </w:r>
-    </w:p>
-    <w:p>
-      <w:pPr>
-        <w:spacing w:after="100"/>
-      </w:pPr>
-      <w:r>
-        <w:rPr>
-          <w:b/>
-          <w:bCs/>
-        </w:rPr>
-        <w:t xml:space="preserve">Where: </w:t>
-      </w:r>
-      <w:r>
-        <w:t xml:space="preserve">_______________________________________________</w:t>
-      </w:r>
-    </w:p>
-    <w:p>
-      <w:pPr>
-        <w:spacing w:after="100"/>
-      </w:pPr>
-      <w:r>
-        <w:rPr>
-          <w:b/>
-          <w:bCs/>
-        </w:rPr>
-        <w:t xml:space="preserve">When: </w:t>
-      </w:r>
-      <w:r>
-        <w:t xml:space="preserve">_______________________________________________</w:t>
-      </w:r>
-    </w:p>
-    <w:p>
-      <w:pPr>
-        <w:spacing w:after="100"/>
-      </w:pPr>
-      <w:r>
-        <w:rPr>
-          <w:b/>
-          <w:bCs/>
-        </w:rPr>
-        <w:t xml:space="preserve">Why this trip: </w:t>
-      </w:r>
-      <w:r>
-        <w:t xml:space="preserve">_______________________________________________</w:t>
-      </w:r>
-    </w:p>
-    <w:p>
-      <w:pPr>
-        <w:spacing w:after="100"/>
-      </w:pPr>
-      <w:r>
-        <w:rPr>
-          <w:b/>
-          <w:bCs/>
-        </w:rPr>
-        <w:t xml:space="preserve">The stated goal: </w:t>
-      </w:r>
-      <w:r>
-        <w:t xml:space="preserve">_______________________________________________</w:t>
-      </w:r>
-    </w:p>
-    <w:p>
-      <w:pPr>
-        <w:spacing w:after="100"/>
-      </w:pPr>
-      <w:r>
-        <w:rPr>
-          <w:b/>
-          <w:bCs/>
-        </w:rPr>
-        <w:t xml:space="preserve">The actual outcome: </w:t>
-      </w:r>
-      <w:r>
-        <w:t xml:space="preserve">_______________________________________________</w:t>
-      </w:r>
-    </w:p>
-    <w:p>
-      <w:pPr>
-        <w:spacing w:after="100"/>
-      </w:pPr>
-      <w:r>
-        <w:rPr>
-          <w:b/>
-          <w:bCs/>
-        </w:rPr>
-        <w:t xml:space="preserve">The real goal (what actually mattered): </w:t>
-      </w:r>
-      <w:r>
-        <w:t xml:space="preserve">_______________________________________________</w:t>
-      </w:r>
-    </w:p>
-    <w:p>
-      <w:pPr>
-        <w:pStyle w:val="Heading1"/>
-        <w:spacing w:after="120" w:before="300"/>
-      </w:pPr>
-      <w:r>
-        <w:t xml:space="preserve">5. OPEN-QUESTION LADDER (CORE)</w:t>
+        <w:t xml:space="preserve">6. OPEN-QUESTION LADDER (CORE)</w:t>
       </w:r>
     </w:p>
     <w:p>
@@ -612,49 +754,49 @@
           <w:iCs/>
           <w:color w:val="555555"/>
         </w:rPr>
-        <w:t xml:space="preserve">NOT a copy of the beat list. At each rung: what open question is the viewer holding, and at which beat does it get answered? Unanswered questions are what hold attention; answered ones release it. Never answer the biggest question before the smallest ones.</w:t>
-      </w:r>
-    </w:p>
-    <w:p>
-      <w:pPr>
-        <w:spacing w:after="100"/>
-      </w:pPr>
-      <w:r>
-        <w:rPr>
-          <w:b/>
-          <w:bCs/>
-        </w:rPr>
-        <w:t xml:space="preserve">Rung 1 — question raised / answered at beat #: </w:t>
-      </w:r>
-      <w:r>
-        <w:t xml:space="preserve">_______________________________________________</w:t>
-      </w:r>
-    </w:p>
-    <w:p>
-      <w:pPr>
-        <w:spacing w:after="100"/>
-      </w:pPr>
-      <w:r>
-        <w:rPr>
-          <w:b/>
-          <w:bCs/>
-        </w:rPr>
-        <w:t xml:space="preserve">Rung 2 — question raised / answered at beat #: </w:t>
-      </w:r>
-      <w:r>
-        <w:t xml:space="preserve">_______________________________________________</w:t>
-      </w:r>
-    </w:p>
-    <w:p>
-      <w:pPr>
-        <w:spacing w:after="100"/>
-      </w:pPr>
-      <w:r>
-        <w:rPr>
-          <w:b/>
-          <w:bCs/>
-        </w:rPr>
-        <w:t xml:space="preserve">Rung 3 — question raised / answered at beat #: </w:t>
+        <w:t xml:space="preserve">NOT a copy of the beat list. Each rung: what open question is the viewer holding, and at which beat does it resolve? Never answer the biggest question before the smallest.</w:t>
+      </w:r>
+    </w:p>
+    <w:p>
+      <w:pPr>
+        <w:spacing w:after="100"/>
+      </w:pPr>
+      <w:r>
+        <w:rPr>
+          <w:b/>
+          <w:bCs/>
+        </w:rPr>
+        <w:t xml:space="preserve">Rung 1 — question / answered at beat #: </w:t>
+      </w:r>
+      <w:r>
+        <w:t xml:space="preserve">_______________________________________________</w:t>
+      </w:r>
+    </w:p>
+    <w:p>
+      <w:pPr>
+        <w:spacing w:after="100"/>
+      </w:pPr>
+      <w:r>
+        <w:rPr>
+          <w:b/>
+          <w:bCs/>
+        </w:rPr>
+        <w:t xml:space="preserve">Rung 2 — question / answered at beat #: </w:t>
+      </w:r>
+      <w:r>
+        <w:t xml:space="preserve">_______________________________________________</w:t>
+      </w:r>
+    </w:p>
+    <w:p>
+      <w:pPr>
+        <w:spacing w:after="100"/>
+      </w:pPr>
+      <w:r>
+        <w:rPr>
+          <w:b/>
+          <w:bCs/>
+        </w:rPr>
+        <w:t xml:space="preserve">Rung 3 — question / answered at beat #: </w:t>
       </w:r>
       <w:r>
         <w:t xml:space="preserve">_______________________________________________</w:t>
@@ -699,7 +841,7 @@
           <w:b/>
           <w:bCs/>
         </w:rPr>
-        <w:t xml:space="preserve">Midpoint re-engagement — which beat raises a NEW question to reset attention: </w:t>
+        <w:t xml:space="preserve">Midpoint re-engagement — which beat raises a NEW question: </w:t>
       </w:r>
       <w:r>
         <w:t xml:space="preserve">_______________________________________________</w:t>
@@ -711,15 +853,20 @@
         <w:spacing w:after="120" w:before="300"/>
       </w:pPr>
       <w:r>
-        <w:t xml:space="preserve">6. EVERY STORY BEAT IN ORDER (CORE)</w:t>
-      </w:r>
-    </w:p>
-    <w:p>
-      <w:pPr>
-        <w:spacing w:after="100"/>
-      </w:pPr>
-      <w:r>
-        <w:t xml:space="preserve">List every beat start to finish. Be specific. This becomes your shot list.</w:t>
+        <w:t xml:space="preserve">7. STORY BEATS + SHOT LIST (CORE)</w:t>
+      </w:r>
+    </w:p>
+    <w:p>
+      <w:pPr>
+        <w:spacing w:after="120"/>
+      </w:pPr>
+      <w:r>
+        <w:rPr>
+          <w:i/>
+          <w:iCs/>
+          <w:color w:val="555555"/>
+        </w:rPr>
+        <w:t xml:space="preserve">Each beat = one line of story + the shots it needs + footage status. Circle one: HAVE (in library) / NEED (shoot it) / AI (generate) / CUT (drop the beat). No script until every beat resolves to HAVE, AI, or CUT.</w:t>
       </w:r>
     </w:p>
     <w:p>
@@ -730,7 +877,7 @@
         <w:t xml:space="preserve">1.  </w:t>
       </w:r>
       <w:r>
-        <w:t xml:space="preserve">________________________________________________________________</w:t>
+        <w:t xml:space="preserve">____________________________________________  |  Shots: ____________________  |  Footage: HAVE / NEED / AI / CUT</w:t>
       </w:r>
     </w:p>
     <w:p>
@@ -741,7 +888,7 @@
         <w:t xml:space="preserve">2.  </w:t>
       </w:r>
       <w:r>
-        <w:t xml:space="preserve">________________________________________________________________</w:t>
+        <w:t xml:space="preserve">____________________________________________  |  Shots: ____________________  |  Footage: HAVE / NEED / AI / CUT</w:t>
       </w:r>
     </w:p>
     <w:p>
@@ -752,7 +899,7 @@
         <w:t xml:space="preserve">3.  </w:t>
       </w:r>
       <w:r>
-        <w:t xml:space="preserve">________________________________________________________________</w:t>
+        <w:t xml:space="preserve">____________________________________________  |  Shots: ____________________  |  Footage: HAVE / NEED / AI / CUT</w:t>
       </w:r>
     </w:p>
     <w:p>
@@ -763,7 +910,7 @@
         <w:t xml:space="preserve">4.  </w:t>
       </w:r>
       <w:r>
-        <w:t xml:space="preserve">________________________________________________________________</w:t>
+        <w:t xml:space="preserve">____________________________________________  |  Shots: ____________________  |  Footage: HAVE / NEED / AI / CUT</w:t>
       </w:r>
     </w:p>
     <w:p>
@@ -774,7 +921,7 @@
         <w:t xml:space="preserve">5.  </w:t>
       </w:r>
       <w:r>
-        <w:t xml:space="preserve">________________________________________________________________</w:t>
+        <w:t xml:space="preserve">____________________________________________  |  Shots: ____________________  |  Footage: HAVE / NEED / AI / CUT</w:t>
       </w:r>
     </w:p>
     <w:p>
@@ -785,7 +932,7 @@
         <w:t xml:space="preserve">6.  </w:t>
       </w:r>
       <w:r>
-        <w:t xml:space="preserve">________________________________________________________________</w:t>
+        <w:t xml:space="preserve">____________________________________________  |  Shots: ____________________  |  Footage: HAVE / NEED / AI / CUT</w:t>
       </w:r>
     </w:p>
     <w:p>
@@ -796,7 +943,7 @@
         <w:t xml:space="preserve">7.  </w:t>
       </w:r>
       <w:r>
-        <w:t xml:space="preserve">________________________________________________________________</w:t>
+        <w:t xml:space="preserve">____________________________________________  |  Shots: ____________________  |  Footage: HAVE / NEED / AI / CUT</w:t>
       </w:r>
     </w:p>
     <w:p>
@@ -807,7 +954,7 @@
         <w:t xml:space="preserve">8.  </w:t>
       </w:r>
       <w:r>
-        <w:t xml:space="preserve">________________________________________________________________</w:t>
+        <w:t xml:space="preserve">____________________________________________  |  Shots: ____________________  |  Footage: HAVE / NEED / AI / CUT</w:t>
       </w:r>
     </w:p>
     <w:p>
@@ -818,7 +965,7 @@
         <w:t xml:space="preserve">9.  </w:t>
       </w:r>
       <w:r>
-        <w:t xml:space="preserve">________________________________________________________________</w:t>
+        <w:t xml:space="preserve">____________________________________________  |  Shots: ____________________  |  Footage: HAVE / NEED / AI / CUT</w:t>
       </w:r>
     </w:p>
     <w:p>
@@ -829,7 +976,7 @@
         <w:t xml:space="preserve">10.  </w:t>
       </w:r>
       <w:r>
-        <w:t xml:space="preserve">________________________________________________________________</w:t>
+        <w:t xml:space="preserve">____________________________________________  |  Shots: ____________________  |  Footage: HAVE / NEED / AI / CUT</w:t>
       </w:r>
     </w:p>
     <w:p>
@@ -840,7 +987,7 @@
         <w:t xml:space="preserve">11.  </w:t>
       </w:r>
       <w:r>
-        <w:t xml:space="preserve">________________________________________________________________</w:t>
+        <w:t xml:space="preserve">____________________________________________  |  Shots: ____________________  |  Footage: HAVE / NEED / AI / CUT</w:t>
       </w:r>
     </w:p>
     <w:p>
@@ -851,7 +998,7 @@
         <w:t xml:space="preserve">12.  </w:t>
       </w:r>
       <w:r>
-        <w:t xml:space="preserve">________________________________________________________________</w:t>
+        <w:t xml:space="preserve">____________________________________________  |  Shots: ____________________  |  Footage: HAVE / NEED / AI / CUT</w:t>
       </w:r>
     </w:p>
     <w:p>
@@ -862,7 +1009,7 @@
         <w:t xml:space="preserve">13.  </w:t>
       </w:r>
       <w:r>
-        <w:t xml:space="preserve">________________________________________________________________</w:t>
+        <w:t xml:space="preserve">____________________________________________  |  Shots: ____________________  |  Footage: HAVE / NEED / AI / CUT</w:t>
       </w:r>
     </w:p>
     <w:p>
@@ -873,7 +1020,7 @@
         <w:t xml:space="preserve">14.  </w:t>
       </w:r>
       <w:r>
-        <w:t xml:space="preserve">________________________________________________________________</w:t>
+        <w:t xml:space="preserve">____________________________________________  |  Shots: ____________________  |  Footage: HAVE / NEED / AI / CUT</w:t>
       </w:r>
     </w:p>
     <w:p>
@@ -884,7 +1031,7 @@
         <w:t xml:space="preserve">15.  </w:t>
       </w:r>
       <w:r>
-        <w:t xml:space="preserve">________________________________________________________________</w:t>
+        <w:t xml:space="preserve">____________________________________________  |  Shots: ____________________  |  Footage: HAVE / NEED / AI / CUT</w:t>
       </w:r>
     </w:p>
     <w:p>
@@ -895,7 +1042,7 @@
         <w:t xml:space="preserve">16.  </w:t>
       </w:r>
       <w:r>
-        <w:t xml:space="preserve">________________________________________________________________</w:t>
+        <w:t xml:space="preserve">____________________________________________  |  Shots: ____________________  |  Footage: HAVE / NEED / AI / CUT</w:t>
       </w:r>
     </w:p>
     <w:p>
@@ -906,7 +1053,7 @@
         <w:t xml:space="preserve">17.  </w:t>
       </w:r>
       <w:r>
-        <w:t xml:space="preserve">________________________________________________________________</w:t>
+        <w:t xml:space="preserve">____________________________________________  |  Shots: ____________________  |  Footage: HAVE / NEED / AI / CUT</w:t>
       </w:r>
     </w:p>
     <w:p>
@@ -917,7 +1064,7 @@
         <w:t xml:space="preserve">18.  </w:t>
       </w:r>
       <w:r>
-        <w:t xml:space="preserve">________________________________________________________________</w:t>
+        <w:t xml:space="preserve">____________________________________________  |  Shots: ____________________  |  Footage: HAVE / NEED / AI / CUT</w:t>
       </w:r>
     </w:p>
     <w:p>
@@ -928,7 +1075,7 @@
         <w:t xml:space="preserve">19.  </w:t>
       </w:r>
       <w:r>
-        <w:t xml:space="preserve">________________________________________________________________</w:t>
+        <w:t xml:space="preserve">____________________________________________  |  Shots: ____________________  |  Footage: HAVE / NEED / AI / CUT</w:t>
       </w:r>
     </w:p>
     <w:p>
@@ -939,7 +1086,7 @@
         <w:t xml:space="preserve">20.  </w:t>
       </w:r>
       <w:r>
-        <w:t xml:space="preserve">________________________________________________________________</w:t>
+        <w:t xml:space="preserve">____________________________________________  |  Shots: ____________________  |  Footage: HAVE / NEED / AI / CUT</w:t>
       </w:r>
     </w:p>
     <w:p>
@@ -948,7 +1095,7 @@
         <w:spacing w:after="120" w:before="300"/>
       </w:pPr>
       <w:r>
-        <w:t xml:space="preserve">7. GOALS OF THIS REEL (CORE)</w:t>
+        <w:t xml:space="preserve">8. GOALS OF THIS REEL (CORE)</w:t>
       </w:r>
     </w:p>
     <w:p>
@@ -1035,25 +1182,38 @@
           <w:b/>
           <w:bCs/>
         </w:rPr>
-        <w:t xml:space="preserve">DM-share trigger — who sends this to whom, and why (top 2026 Reels signal): </w:t>
-      </w:r>
-      <w:r>
-        <w:t xml:space="preserve">_______________________________________________</w:t>
-      </w:r>
-    </w:p>
-    <w:p>
-      <w:pPr>
-        <w:spacing w:after="100"/>
-      </w:pPr>
-      <w:r>
-        <w:rPr>
-          <w:b/>
-          <w:bCs/>
-        </w:rPr>
-        <w:t xml:space="preserve">Series continuity (how this links to other stories): </w:t>
-      </w:r>
-      <w:r>
-        <w:t xml:space="preserve">_______________________________________________</w:t>
+        <w:t xml:space="preserve">DM-share trigger — who sends this to whom, and why: </w:t>
+      </w:r>
+      <w:r>
+        <w:t xml:space="preserve">_______________________________________________</w:t>
+      </w:r>
+    </w:p>
+    <w:p>
+      <w:pPr>
+        <w:spacing w:after="100"/>
+      </w:pPr>
+      <w:r>
+        <w:rPr>
+          <w:b/>
+          <w:bCs/>
+        </w:rPr>
+        <w:t xml:space="preserve">Series continuity (standalone / lesson-linked to: ______ ): </w:t>
+      </w:r>
+      <w:r>
+        <w:t xml:space="preserve">_______________________________________________</w:t>
+      </w:r>
+    </w:p>
+    <w:p>
+      <w:pPr>
+        <w:spacing w:after="120"/>
+      </w:pPr>
+      <w:r>
+        <w:rPr>
+          <w:i/>
+          <w:iCs/>
+          <w:color w:val="555555"/>
+        </w:rPr>
+        <w:t xml:space="preserve">Lesson-linked stories ship as explicit mini-series (Part 1/2/3, back-to-back weeks). Standalone ships any order.</w:t>
       </w:r>
     </w:p>
     <w:p>
@@ -1062,7 +1222,7 @@
         <w:spacing w:after="120" w:before="300"/>
       </w:pPr>
       <w:r>
-        <w:t xml:space="preserve">8. THE LESSON (CORE)</w:t>
+        <w:t xml:space="preserve">9. THE LESSON (CORE)</w:t>
       </w:r>
     </w:p>
     <w:p>
@@ -1097,54 +1257,39 @@
         <w:spacing w:after="60"/>
       </w:pPr>
       <w:r>
-        <w:t xml:space="preserve">1.  </w:t>
-      </w:r>
-      <w:r>
-        <w:t xml:space="preserve">________________________________________________________________</w:t>
-      </w:r>
-    </w:p>
-    <w:p>
-      <w:pPr>
-        <w:spacing w:after="60"/>
-      </w:pPr>
-      <w:r>
-        <w:t xml:space="preserve">2.  </w:t>
-      </w:r>
-      <w:r>
-        <w:t xml:space="preserve">________________________________________________________________</w:t>
-      </w:r>
-    </w:p>
-    <w:p>
-      <w:pPr>
-        <w:spacing w:after="60"/>
-      </w:pPr>
-      <w:r>
-        <w:t xml:space="preserve">3.  </w:t>
-      </w:r>
-      <w:r>
-        <w:t xml:space="preserve">________________________________________________________________</w:t>
-      </w:r>
-    </w:p>
-    <w:p>
-      <w:pPr>
-        <w:spacing w:after="60"/>
-      </w:pPr>
-      <w:r>
-        <w:t xml:space="preserve">4.  </w:t>
-      </w:r>
-      <w:r>
-        <w:t xml:space="preserve">________________________________________________________________</w:t>
-      </w:r>
-    </w:p>
-    <w:p>
-      <w:pPr>
-        <w:spacing w:after="60"/>
-      </w:pPr>
-      <w:r>
-        <w:t xml:space="preserve">5.  </w:t>
-      </w:r>
-      <w:r>
-        <w:t xml:space="preserve">________________________________________________________________</w:t>
+        <w:t xml:space="preserve">1.  ________________________________________________________________</w:t>
+      </w:r>
+    </w:p>
+    <w:p>
+      <w:pPr>
+        <w:spacing w:after="60"/>
+      </w:pPr>
+      <w:r>
+        <w:t xml:space="preserve">2.  ________________________________________________________________</w:t>
+      </w:r>
+    </w:p>
+    <w:p>
+      <w:pPr>
+        <w:spacing w:after="60"/>
+      </w:pPr>
+      <w:r>
+        <w:t xml:space="preserve">3.  ________________________________________________________________</w:t>
+      </w:r>
+    </w:p>
+    <w:p>
+      <w:pPr>
+        <w:spacing w:after="60"/>
+      </w:pPr>
+      <w:r>
+        <w:t xml:space="preserve">4.  ________________________________________________________________</w:t>
+      </w:r>
+    </w:p>
+    <w:p>
+      <w:pPr>
+        <w:spacing w:after="60"/>
+      </w:pPr>
+      <w:r>
+        <w:t xml:space="preserve">5.  ________________________________________________________________</w:t>
       </w:r>
     </w:p>
     <w:p>
@@ -1168,15 +1313,76 @@
         <w:spacing w:after="120" w:before="300"/>
       </w:pPr>
       <w:r>
-        <w:t xml:space="preserve">9. MUST NEVER BE FORGOTTEN (CORE)</w:t>
-      </w:r>
-    </w:p>
-    <w:p>
-      <w:pPr>
-        <w:spacing w:after="100"/>
-      </w:pPr>
-      <w:r>
-        <w:t xml:space="preserve">Story-specific rules that cannot be violated in the script.</w:t>
+        <w:t xml:space="preserve">10. CAPTION / TITLE BLOCK (CORE)</w:t>
+      </w:r>
+    </w:p>
+    <w:p>
+      <w:pPr>
+        <w:spacing w:after="100"/>
+      </w:pPr>
+      <w:r>
+        <w:rPr>
+          <w:b/>
+          <w:bCs/>
+        </w:rPr>
+        <w:t xml:space="preserve">Caption first line — the SECOND hook (all that shows before '...more'): </w:t>
+      </w:r>
+      <w:r>
+        <w:t xml:space="preserve">_______________________________________________</w:t>
+      </w:r>
+    </w:p>
+    <w:p>
+      <w:pPr>
+        <w:spacing w:after="100"/>
+      </w:pPr>
+      <w:r>
+        <w:rPr>
+          <w:b/>
+          <w:bCs/>
+        </w:rPr>
+        <w:t xml:space="preserve">Pinned comment (lesson breakdown lives here): </w:t>
+      </w:r>
+      <w:r>
+        <w:t xml:space="preserve">_______________________________________________</w:t>
+      </w:r>
+    </w:p>
+    <w:p>
+      <w:pPr>
+        <w:spacing w:after="100"/>
+      </w:pPr>
+      <w:r>
+        <w:rPr>
+          <w:b/>
+          <w:bCs/>
+        </w:rPr>
+        <w:t xml:space="preserve">Hashtags (3–5, filing labels only — not growth levers): </w:t>
+      </w:r>
+      <w:r>
+        <w:t xml:space="preserve">_______________________________________________</w:t>
+      </w:r>
+    </w:p>
+    <w:p>
+      <w:pPr>
+        <w:spacing w:after="100"/>
+      </w:pPr>
+      <w:r>
+        <w:rPr>
+          <w:b/>
+          <w:bCs/>
+        </w:rPr>
+        <w:t xml:space="preserve">YouTube Shorts title (keyword-searchable — Shorts ARE indexed for search, unlike TikTok): </w:t>
+      </w:r>
+      <w:r>
+        <w:t xml:space="preserve">_______________________________________________</w:t>
+      </w:r>
+    </w:p>
+    <w:p>
+      <w:pPr>
+        <w:pStyle w:val="Heading1"/>
+        <w:spacing w:after="120" w:before="300"/>
+      </w:pPr>
+      <w:r>
+        <w:t xml:space="preserve">11. MUST NEVER BE FORGOTTEN (CORE)</w:t>
       </w:r>
     </w:p>
     <w:p>
@@ -1237,35 +1443,42 @@
     </w:p>
     <w:p>
       <w:pPr>
-        <w:spacing w:after="60"/>
-      </w:pPr>
-      <w:r>
-        <w:t xml:space="preserve">8.  </w:t>
-      </w:r>
-      <w:r>
-        <w:t xml:space="preserve">________________________________________________________________</w:t>
-      </w:r>
-    </w:p>
-    <w:p>
-      <w:pPr>
-        <w:spacing w:after="60"/>
-      </w:pPr>
-      <w:r>
-        <w:t xml:space="preserve">9.  </w:t>
-      </w:r>
-      <w:r>
-        <w:t xml:space="preserve">________________________________________________________________</w:t>
-      </w:r>
-    </w:p>
-    <w:p>
-      <w:pPr>
-        <w:spacing w:after="60"/>
-      </w:pPr>
-      <w:r>
-        <w:t xml:space="preserve">10.  </w:t>
-      </w:r>
-      <w:r>
-        <w:t xml:space="preserve">________________________________________________________________</w:t>
+        <w:spacing w:after="100"/>
+      </w:pPr>
+      <w:r>
+        <w:t xml:space="preserve">8.  Never state the false assumption out loud — let the viewer build it</w:t>
+      </w:r>
+    </w:p>
+    <w:p>
+      <w:pPr>
+        <w:spacing w:after="100"/>
+      </w:pPr>
+      <w:r>
+        <w:t xml:space="preserve">9.  Never twist without planted clues</w:t>
+      </w:r>
+    </w:p>
+    <w:p>
+      <w:pPr>
+        <w:spacing w:after="100"/>
+      </w:pPr>
+      <w:r>
+        <w:t xml:space="preserve">10. Never reuse the same hook subject or type back-to-back</w:t>
+      </w:r>
+    </w:p>
+    <w:p>
+      <w:pPr>
+        <w:spacing w:after="60"/>
+      </w:pPr>
+      <w:r>
+        <w:t xml:space="preserve">11.  ________________________________________________________________</w:t>
+      </w:r>
+    </w:p>
+    <w:p>
+      <w:pPr>
+        <w:spacing w:after="60"/>
+      </w:pPr>
+      <w:r>
+        <w:t xml:space="preserve">12.  ________________________________________________________________</w:t>
       </w:r>
     </w:p>
     <w:p>
@@ -1299,34 +1512,34 @@
         <w:spacing w:after="120" w:before="300"/>
       </w:pPr>
       <w:r>
-        <w:t xml:space="preserve">10. EXTENDED FIELDS</w:t>
-      </w:r>
-    </w:p>
-    <w:p>
-      <w:pPr>
-        <w:spacing w:after="100"/>
-      </w:pPr>
-      <w:r>
-        <w:rPr>
-          <w:b/>
-          <w:bCs/>
-        </w:rPr>
-        <w:t xml:space="preserve">Completion promise — does the viewer know up front how much story they're committing to: </w:t>
-      </w:r>
-      <w:r>
-        <w:t xml:space="preserve">_______________________________________________</w:t>
-      </w:r>
-    </w:p>
-    <w:p>
-      <w:pPr>
-        <w:spacing w:after="100"/>
-      </w:pPr>
-      <w:r>
-        <w:rPr>
-          <w:b/>
-          <w:bCs/>
-        </w:rPr>
-        <w:t xml:space="preserve">Series binge trigger — why someone watches episode 2 immediately, not eventually: </w:t>
+        <w:t xml:space="preserve">12. EXTENDED FIELDS</w:t>
+      </w:r>
+    </w:p>
+    <w:p>
+      <w:pPr>
+        <w:spacing w:after="100"/>
+      </w:pPr>
+      <w:r>
+        <w:rPr>
+          <w:b/>
+          <w:bCs/>
+        </w:rPr>
+        <w:t xml:space="preserve">Completion promise — does the viewer know how much story they're committing to: </w:t>
+      </w:r>
+      <w:r>
+        <w:t xml:space="preserve">_______________________________________________</w:t>
+      </w:r>
+    </w:p>
+    <w:p>
+      <w:pPr>
+        <w:spacing w:after="100"/>
+      </w:pPr>
+      <w:r>
+        <w:rPr>
+          <w:b/>
+          <w:bCs/>
+        </w:rPr>
+        <w:t xml:space="preserve">Series binge trigger — why someone watches episode 2 immediately: </w:t>
       </w:r>
       <w:r>
         <w:t xml:space="preserve">_______________________________________________</w:t>
@@ -1357,6 +1570,21 @@
           <w:bCs/>
         </w:rPr>
         <w:t xml:space="preserve">Technical requirements: </w:t>
+      </w:r>
+      <w:r>
+        <w:t xml:space="preserve">_______________________________________________</w:t>
+      </w:r>
+    </w:p>
+    <w:p>
+      <w:pPr>
+        <w:spacing w:after="100"/>
+      </w:pPr>
+      <w:r>
+        <w:rPr>
+          <w:b/>
+          <w:bCs/>
+        </w:rPr>
+        <w:t xml:space="preserve">Long-form note — does this story belong in a future YouTube long-form master edit? Which one: </w:t>
       </w:r>
       <w:r>
         <w:t xml:space="preserve">_______________________________________________</w:t>
@@ -1376,20 +1604,7 @@
         <w:spacing w:after="120" w:before="300"/>
       </w:pPr>
       <w:r>
-        <w:t xml:space="preserve">11. RETENTION REVIEW — POST-PUBLISH (MANDATORY, 5 MIN MAX)</w:t>
-      </w:r>
-    </w:p>
-    <w:p>
-      <w:pPr>
-        <w:spacing w:after="120"/>
-      </w:pPr>
-      <w:r>
-        <w:rPr>
-          <w:i/>
-          <w:iCs/>
-          <w:color w:val="555555"/>
-        </w:rPr>
-        <w:t xml:space="preserve">Fill in after the reel is live, before the next Bible. Fix the exact drop-off point on the next video — never guess.</w:t>
+        <w:t xml:space="preserve">13. RETENTION REVIEW — POST-PUBLISH (MANDATORY, 5 MIN MAX)</w:t>
       </w:r>
     </w:p>
     <w:p>
@@ -1402,6 +1617,21 @@
           <w:bCs/>
         </w:rPr>
         <w:t xml:space="preserve">3-second hold rate (hook rate): </w:t>
+      </w:r>
+      <w:r>
+        <w:t xml:space="preserve">_______________________________________________</w:t>
+      </w:r>
+    </w:p>
+    <w:p>
+      <w:pPr>
+        <w:spacing w:after="100"/>
+      </w:pPr>
+      <w:r>
+        <w:rPr>
+          <w:b/>
+          <w:bCs/>
+        </w:rPr>
+        <w:t xml:space="preserve">Hook type + subject used (log for pattern analysis over 5–10 posts): </w:t>
       </w:r>
       <w:r>
         <w:t xml:space="preserve">_______________________________________________</w:t>
@@ -1485,7 +1715,7 @@
           <w:b/>
           <w:bCs/>
         </w:rPr>
-        <w:t xml:space="preserve">Previous episode's carry-forward change (pull from last Retention Review — REQUIRED before approval): </w:t>
+        <w:t xml:space="preserve">Previous episode's carry-forward change (REQUIRED — pull from last Retention Review): </w:t>
       </w:r>
       <w:r>
         <w:t xml:space="preserve">_______________________________________________</w:t>
@@ -1553,7 +1783,7 @@
           <w:b/>
           <w:bCs/>
         </w:rPr>
-        <w:t xml:space="preserve">No script is written until CORE sections are complete and Chris has confirmed approval.</w:t>
+        <w:t xml:space="preserve">No script is written until CORE sections are complete, every beat's footage status resolves, and Chris has confirmed approval.</w:t>
       </w:r>
     </w:p>
     <w:sectPr>

</xml_diff>